<commit_message>
Assigned collectors can read their incident; route-plan conflicts name tasks and plans; record the eight owner launch decisions and the GitGuardian investigation
Co-authored-by: arena-agent <297053741+arena-agent@users.noreply.github.com>
</commit_message>
<xml_diff>
--- a/docs/exports/EcoMind-AI-Audit-Report.docx
+++ b/docs/exports/EcoMind-AI-Audit-Report.docx
@@ -3276,6 +3276,48 @@
     </w:p>
     <w:p>
       <w:pPr>
+        <w:pStyle w:val="BlockText"/>
+      </w:pPr>
+      <w:r>
+        <w:rPr>
+          <w:b/>
+          <w:bCs/>
+        </w:rPr>
+        <w:t xml:space="preserve">Update:</w:t>
+      </w:r>
+      <w:r>
+        <w:t xml:space="preserve"> </w:t>
+      </w:r>
+      <w:r>
+        <w:t xml:space="preserve">the owner answered all eight on 2026-10-21. The answers, what is done and what still needs an owner action are in</w:t>
+      </w:r>
+      <w:r>
+        <w:t xml:space="preserve"> </w:t>
+      </w:r>
+      <w:r>
+        <w:rPr>
+          <w:rStyle w:val="VerbatimChar"/>
+        </w:rPr>
+        <w:t xml:space="preserve">docs/project-completion/DECISION_LOG.md</w:t>
+      </w:r>
+      <w:r>
+        <w:t xml:space="preserve"> </w:t>
+      </w:r>
+      <w:r>
+        <w:t xml:space="preserve">(section</w:t>
+      </w:r>
+      <w:r>
+        <w:t xml:space="preserve"> </w:t>
+      </w:r>
+      <w:r>
+        <w:t xml:space="preserve">“Owner decisions on the eight launch questions”</w:t>
+      </w:r>
+      <w:r>
+        <w:t xml:space="preserve">). The list below is the original question list.</w:t>
+      </w:r>
+    </w:p>
+    <w:p>
+      <w:pPr>
         <w:pStyle w:val="Compact"/>
         <w:numPr>
           <w:ilvl w:val="0"/>
@@ -3510,43 +3552,85 @@
           <w:b/>
           <w:bCs/>
         </w:rPr>
-        <w:t xml:space="preserve">Open issues (none blocks a demo)</w:t>
-      </w:r>
-      <w:r>
-        <w:t xml:space="preserve"> </w:t>
-      </w:r>
-      <w:r>
-        <w:t xml:space="preserve">1. A collector who is assigned an incident cannot open it. Incident visibility is</w:t>
-      </w:r>
-      <w:r>
-        <w:t xml:space="preserve"> </w:t>
-      </w:r>
-      <w:r>
-        <w:t xml:space="preserve">“own report”</w:t>
-      </w:r>
-      <w:r>
-        <w:t xml:space="preserve"> </w:t>
-      </w:r>
-      <w:r>
-        <w:t xml:space="preserve">or</w:t>
-      </w:r>
-      <w:r>
-        <w:t xml:space="preserve"> </w:t>
-      </w:r>
-      <w:r>
-        <w:t xml:space="preserve">“triage permission”</w:t>
-      </w:r>
-      <w:r>
-        <w:t xml:space="preserve"> </w:t>
-      </w:r>
-      <w:r>
-        <w:t xml:space="preserve">only. Decision needed: either give assigned collectors read access or leave incidents out of collector workflows.</w:t>
-      </w:r>
-      <w:r>
-        <w:t xml:space="preserve"> </w:t>
-      </w:r>
-      <w:r>
-        <w:t xml:space="preserve">2. When a route plan cannot be created because a task is already in another active plan, the message shows the other plan’s internal ID instead of its name.</w:t>
+        <w:t xml:space="preserve">Open issues (none blocks a demo; numbers 1 and 2 are now closed)</w:t>
+      </w:r>
+      <w:r>
+        <w:t xml:space="preserve"> </w:t>
+      </w:r>
+      <w:r>
+        <w:t xml:space="preserve">1.</w:t>
+      </w:r>
+      <w:r>
+        <w:t xml:space="preserve"> </w:t>
+      </w:r>
+      <w:r>
+        <w:rPr>
+          <w:strike/>
+        </w:rPr>
+        <w:t xml:space="preserve">A collector who is assigned an incident cannot open it.</w:t>
+      </w:r>
+      <w:r>
+        <w:t xml:space="preserve"> </w:t>
+      </w:r>
+      <w:r>
+        <w:rPr>
+          <w:b/>
+          <w:bCs/>
+        </w:rPr>
+        <w:t xml:space="preserve">Fixed after the audit</w:t>
+      </w:r>
+      <w:r>
+        <w:t xml:space="preserve"> </w:t>
+      </w:r>
+      <w:r>
+        <w:t xml:space="preserve">(see the update note below).</w:t>
+      </w:r>
+      <w:r>
+        <w:t xml:space="preserve"> </w:t>
+      </w:r>
+      <w:r>
+        <w:t xml:space="preserve">2.</w:t>
+      </w:r>
+      <w:r>
+        <w:t xml:space="preserve"> </w:t>
+      </w:r>
+      <w:r>
+        <w:rPr>
+          <w:strike/>
+        </w:rPr>
+        <w:t xml:space="preserve">A route-plan conflict message showed an internal ID.</w:t>
+      </w:r>
+      <w:r>
+        <w:t xml:space="preserve"> </w:t>
+      </w:r>
+      <w:r>
+        <w:rPr>
+          <w:b/>
+          <w:bCs/>
+        </w:rPr>
+        <w:t xml:space="preserve">Fixed after the audit.</w:t>
+      </w:r>
+      <w:r>
+        <w:t xml:space="preserve"> </w:t>
+      </w:r>
+      <w:r>
+        <w:t xml:space="preserve">(Correction: the ID it showed was the</w:t>
+      </w:r>
+      <w:r>
+        <w:t xml:space="preserve"> </w:t>
+      </w:r>
+      <w:r>
+        <w:rPr>
+          <w:i/>
+          <w:iCs/>
+        </w:rPr>
+        <w:t xml:space="preserve">task’s</w:t>
+      </w:r>
+      <w:r>
+        <w:t xml:space="preserve"> </w:t>
+      </w:r>
+      <w:r>
+        <w:t xml:space="preserve">ID, not the other plan’s; I described it wrongly in the first version of this report.) The message now names the task by title and the clashing plan by name.</w:t>
       </w:r>
       <w:r>
         <w:t xml:space="preserve"> </w:t>
@@ -3595,6 +3679,48 @@
       </w:r>
       <w:r>
         <w:t xml:space="preserve">6. There is no frontend coverage measurement and no load or stress test. A light local timing (one user, tiny data, same machine, 30 requests each) gave about 6–8 ms median for list endpoints and 17 ms for the analytics overview. That says nothing about real traffic.</w:t>
+      </w:r>
+    </w:p>
+    <w:p>
+      <w:pPr>
+        <w:pStyle w:val="BodyText"/>
+      </w:pPr>
+      <w:r>
+        <w:rPr>
+          <w:b/>
+          <w:bCs/>
+        </w:rPr>
+        <w:t xml:space="preserve">Update after the audit (2026-10-21, after PR #12 was merged).</w:t>
+      </w:r>
+      <w:r>
+        <w:t xml:space="preserve"> </w:t>
+      </w:r>
+      <w:r>
+        <w:t xml:space="preserve">An assigned collector can now open (read, not change) the incident assigned to them, with a test; route-plan conflict messages name tasks and plans (tests updated). The owner’s decisions on the eight launch questions are recorded in</w:t>
+      </w:r>
+      <w:r>
+        <w:t xml:space="preserve"> </w:t>
+      </w:r>
+      <w:r>
+        <w:rPr>
+          <w:rStyle w:val="VerbatimChar"/>
+        </w:rPr>
+        <w:t xml:space="preserve">DECISION_LOG.md</w:t>
+      </w:r>
+      <w:r>
+        <w:t xml:space="preserve">. The PR #12 mentions in sections 9 and 10 are historical: it was merged on 2026-10-21 as</w:t>
+      </w:r>
+      <w:r>
+        <w:t xml:space="preserve"> </w:t>
+      </w:r>
+      <w:r>
+        <w:rPr>
+          <w:rStyle w:val="VerbatimChar"/>
+        </w:rPr>
+        <w:t xml:space="preserve">2834cf0</w:t>
+      </w:r>
+      <w:r>
+        <w:t xml:space="preserve">.</w:t>
       </w:r>
     </w:p>
     <w:bookmarkEnd w:id="19"/>

</xml_diff>

<commit_message>
Documentation brought up to date: module, ML and architecture READMEs, academic documents rewritten from verified evidence (literature survey, results, methodology, manual), ethics and data statement, paper-readiness assessment, Word exports regenerated
Co-authored-by: arena-agent <297053741+arena-agent@users.noreply.github.com>
</commit_message>
<xml_diff>
--- a/docs/exports/EcoMind-AI-Audit-Report.docx
+++ b/docs/exports/EcoMind-AI-Audit-Report.docx
@@ -21,14 +21,14 @@
         <w:p>
           <w:r>
             <w:fldChar w:fldCharType="begin" w:dirty="true"/>
-            <w:instrText xml:space="preserve">TOC \o "1-2" \h \z \u</w:instrText>
+            <w:instrText xml:space="preserve">TOC \o "1-3" \h \z \u</w:instrText>
             <w:fldChar w:fldCharType="separate"/>
             <w:fldChar w:fldCharType="end"/>
           </w:r>
         </w:p>
       </w:sdtContent>
     </w:sdt>
-    <w:bookmarkStart w:id="23" w:name="X4bc9d5816f8923e72b1a26d98ce20625787583b"/>
+    <w:bookmarkStart w:id="24" w:name="X4bc9d5816f8923e72b1a26d98ce20625787583b"/>
     <w:p>
       <w:pPr>
         <w:pStyle w:val="Heading1"/>
@@ -183,7 +183,54 @@
     </w:tbl>
     <w:p>
       <w:pPr>
-        <w:pStyle w:val="BodyText"/>
+        <w:pStyle w:val="BlockText"/>
+      </w:pPr>
+      <w:r>
+        <w:rPr>
+          <w:b/>
+          <w:bCs/>
+        </w:rPr>
+        <w:t xml:space="preserve">Snapshot note (2026-10-21, later the same day).</w:t>
+      </w:r>
+      <w:r>
+        <w:t xml:space="preserve"> </w:t>
+      </w:r>
+      <w:r>
+        <w:t xml:space="preserve">This report describes the code as audited, at migration 0016. Later changes on the</w:t>
+      </w:r>
+      <w:r>
+        <w:t xml:space="preserve"> </w:t>
+      </w:r>
+      <w:r>
+        <w:rPr>
+          <w:rStyle w:val="VerbatimChar"/>
+        </w:rPr>
+        <w:t xml:space="preserve">arena/174cfaa2-ecomind-ai</w:t>
+      </w:r>
+      <w:r>
+        <w:t xml:space="preserve"> </w:t>
+      </w:r>
+      <w:r>
+        <w:t xml:space="preserve">branch (migration 0017 enforcing append-only audit and status history in the database, the waste-report bbox filter, a safer end-to-end mail helper) are recorded in</w:t>
+      </w:r>
+      <w:r>
+        <w:t xml:space="preserve"> </w:t>
+      </w:r>
+      <w:hyperlink r:id="rId9">
+        <w:r>
+          <w:rPr>
+            <w:rStyle w:val="Hyperlink"/>
+          </w:rPr>
+          <w:t xml:space="preserve">REQUIREMENTS_CLOSURE_REPORT.md</w:t>
+        </w:r>
+      </w:hyperlink>
+      <w:r>
+        <w:t xml:space="preserve">, not here. Counts below are those of the audit.</w:t>
+      </w:r>
+    </w:p>
+    <w:p>
+      <w:pPr>
+        <w:pStyle w:val="FirstParagraph"/>
       </w:pPr>
       <w:r>
         <w:rPr>
@@ -254,7 +301,7 @@
         </w:pict>
       </w:r>
     </w:p>
-    <w:bookmarkStart w:id="9" w:name="verdict-in-one-paragraph"/>
+    <w:bookmarkStart w:id="10" w:name="verdict-in-one-paragraph"/>
     <w:p>
       <w:pPr>
         <w:pStyle w:val="Heading2"/>
@@ -385,8 +432,8 @@
         <w:t xml:space="preserve">; (4) the owner decisions listed in section 10 are still open. None of these is a hidden defect. Each is shown in the product and written down.</w:t>
       </w:r>
     </w:p>
-    <w:bookmarkEnd w:id="9"/>
-    <w:bookmarkStart w:id="10" w:name="scorecard"/>
+    <w:bookmarkEnd w:id="10"/>
+    <w:bookmarkStart w:id="11" w:name="scorecard"/>
     <w:p>
       <w:pPr>
         <w:pStyle w:val="Heading2"/>
@@ -526,7 +573,7 @@
               <w:pStyle w:val="Compact"/>
             </w:pPr>
             <w:r>
-              <w:t xml:space="preserve">46 tables, migrations 0001–0016;</w:t>
+              <w:t xml:space="preserve">46 tables, migrations 0001–0016 at audit time (head is now 0017);</w:t>
             </w:r>
             <w:r>
               <w:t xml:space="preserve"> </w:t>
@@ -993,8 +1040,8 @@
         </w:tc>
       </w:tr>
     </w:tbl>
-    <w:bookmarkEnd w:id="10"/>
-    <w:bookmarkStart w:id="11" w:name="X5298ea6a9f9398adbdc758f4d438099695734de"/>
+    <w:bookmarkEnd w:id="11"/>
+    <w:bookmarkStart w:id="12" w:name="X5298ea6a9f9398adbdc758f4d438099695734de"/>
     <w:p>
       <w:pPr>
         <w:pStyle w:val="Heading2"/>
@@ -1234,8 +1281,8 @@
         </w:tc>
       </w:tr>
     </w:tbl>
-    <w:bookmarkEnd w:id="11"/>
-    <w:bookmarkStart w:id="12" w:name="test-results-from-this-audit"/>
+    <w:bookmarkEnd w:id="12"/>
+    <w:bookmarkStart w:id="13" w:name="test-results-from-this-audit"/>
     <w:p>
       <w:pPr>
         <w:pStyle w:val="Heading2"/>
@@ -1735,8 +1782,8 @@
         <w:t xml:space="preserve">); a citizen reporting an incident and a manager acknowledging it (the citizen was notified); an operator recording a recovery; a manager adding a sorting category and guidance; running a forecast; scanning a series for anomalies; an administrator changing a user’s roles with a reason; the audit log; and the system status page. Those walk-throughs were exploratory scripts, not a saved test suite. They exposed no defect in the product. Every failure I hit came from my script’s assumptions (a required date or time I had not filled in, an option list that loads a moment late). They are listed in section 11 because the manual test guide warns about them.</w:t>
       </w:r>
     </w:p>
-    <w:bookmarkEnd w:id="12"/>
-    <w:bookmarkStart w:id="13" w:name="role-based-access-what-was-checked"/>
+    <w:bookmarkEnd w:id="13"/>
+    <w:bookmarkStart w:id="14" w:name="role-based-access-what-was-checked"/>
     <w:p>
       <w:pPr>
         <w:pStyle w:val="Heading2"/>
@@ -1961,8 +2008,8 @@
         <w:t xml:space="preserve">a collector could not list the incident reports they themselves filed (the permission was missing). Migration 0016 grants it, with a test.</w:t>
       </w:r>
     </w:p>
-    <w:bookmarkEnd w:id="13"/>
-    <w:bookmarkStart w:id="14" w:name="security"/>
+    <w:bookmarkEnd w:id="14"/>
+    <w:bookmarkStart w:id="15" w:name="security"/>
     <w:p>
       <w:pPr>
         <w:pStyle w:val="Heading2"/>
@@ -2531,8 +2578,8 @@
         <w:t xml:space="preserve">). It is a throw-away test value, not a real credential, but only the repository owner can dismiss the alert.</w:t>
       </w:r>
     </w:p>
-    <w:bookmarkEnd w:id="14"/>
-    <w:bookmarkStart w:id="15" w:name="X12ade90e46fb27ad16215bea4ceef33e316e08b"/>
+    <w:bookmarkEnd w:id="15"/>
+    <w:bookmarkStart w:id="16" w:name="X12ade90e46fb27ad16215bea4ceef33e316e08b"/>
     <w:p>
       <w:pPr>
         <w:pStyle w:val="Heading2"/>
@@ -2877,8 +2924,8 @@
         <w:t xml:space="preserve">and offers a support ticket instead). Because the author wrote both sets, treat these as indicative only.</w:t>
       </w:r>
     </w:p>
-    <w:bookmarkEnd w:id="15"/>
-    <w:bookmarkStart w:id="16" w:name="maps-and-tracking"/>
+    <w:bookmarkEnd w:id="16"/>
+    <w:bookmarkStart w:id="17" w:name="maps-and-tracking"/>
     <w:p>
       <w:pPr>
         <w:pStyle w:val="Heading2"/>
@@ -3079,8 +3126,8 @@
         <w:t xml:space="preserve">Private addresses and reporter identity are not exposed on maps.</w:t>
       </w:r>
     </w:p>
-    <w:bookmarkEnd w:id="16"/>
-    <w:bookmarkStart w:id="17" w:name="delivery-and-ci"/>
+    <w:bookmarkEnd w:id="17"/>
+    <w:bookmarkStart w:id="18" w:name="delivery-and-ci"/>
     <w:p>
       <w:pPr>
         <w:pStyle w:val="Heading2"/>
@@ -3264,8 +3311,8 @@
         <w:t xml:space="preserve">No production server, domain, TLS certificate, backup job or monitoring exists.</w:t>
       </w:r>
     </w:p>
-    <w:bookmarkEnd w:id="17"/>
-    <w:bookmarkStart w:id="18" w:name="decisions-only-the-owner-can-make"/>
+    <w:bookmarkEnd w:id="18"/>
+    <w:bookmarkStart w:id="19" w:name="decisions-only-the-owner-can-make"/>
     <w:p>
       <w:pPr>
         <w:pStyle w:val="Heading2"/>
@@ -3424,8 +3471,8 @@
         <w:t xml:space="preserve">Provide a regional map tile file, or approve building one.</w:t>
       </w:r>
     </w:p>
-    <w:bookmarkEnd w:id="18"/>
-    <w:bookmarkStart w:id="19" w:name="findings-from-this-audit"/>
+    <w:bookmarkEnd w:id="19"/>
+    <w:bookmarkStart w:id="20" w:name="findings-from-this-audit"/>
     <w:p>
       <w:pPr>
         <w:pStyle w:val="Heading2"/>
@@ -3723,8 +3770,8 @@
         <w:t xml:space="preserve">.</w:t>
       </w:r>
     </w:p>
-    <w:bookmarkEnd w:id="19"/>
-    <w:bookmarkStart w:id="20" w:name="X69a3748f394012a62a2c915345c3300cc453f36"/>
+    <w:bookmarkEnd w:id="20"/>
+    <w:bookmarkStart w:id="21" w:name="X69a3748f394012a62a2c915345c3300cc453f36"/>
     <w:p>
       <w:pPr>
         <w:pStyle w:val="Heading2"/>
@@ -3841,8 +3888,8 @@
         <w:t xml:space="preserve">Any behaviour under real user load.</w:t>
       </w:r>
     </w:p>
-    <w:bookmarkEnd w:id="20"/>
-    <w:bookmarkStart w:id="21" w:name="recommended-next-steps-in-order"/>
+    <w:bookmarkEnd w:id="21"/>
+    <w:bookmarkStart w:id="22" w:name="recommended-next-steps-in-order"/>
     <w:p>
       <w:pPr>
         <w:pStyle w:val="Heading2"/>
@@ -3944,8 +3991,8 @@
         <w:t xml:space="preserve">Have a person test with a keyboard and a screen reader.</w:t>
       </w:r>
     </w:p>
-    <w:bookmarkEnd w:id="21"/>
-    <w:bookmarkStart w:id="22" w:name="related-documents"/>
+    <w:bookmarkEnd w:id="22"/>
+    <w:bookmarkStart w:id="23" w:name="related-documents"/>
     <w:p>
       <w:pPr>
         <w:pStyle w:val="Heading2"/>
@@ -4047,8 +4094,8 @@
         <w:t xml:space="preserve">RELEASE_CHECKLIST.md</w:t>
       </w:r>
     </w:p>
-    <w:bookmarkEnd w:id="22"/>
     <w:bookmarkEnd w:id="23"/>
+    <w:bookmarkEnd w:id="24"/>
     <w:sectPr>
       <w:footnotePr>
         <w:numRestart w:val="eachSect"/>

</xml_diff>

<commit_message>
TrashNet removal: fix class-scope and API-note tests, update counts and exports, classification README
Co-authored-by: arena-agent <297053741+arena-agent@users.noreply.github.com>
</commit_message>
<xml_diff>
--- a/docs/exports/EcoMind-AI-Audit-Report.docx
+++ b/docs/exports/EcoMind-AI-Audit-Report.docx
@@ -2603,13 +2603,44 @@
         <w:t xml:space="preserve"> </w:t>
       </w:r>
       <w:r>
-        <w:t xml:space="preserve">- The product knows six classes: plastic, paper, cardboard, glass, metal, other waste. It cannot recognise organic waste, e-waste or hazardous items.</w:t>
-      </w:r>
-      <w:r>
-        <w:t xml:space="preserve"> </w:t>
-      </w:r>
-      <w:r>
-        <w:t xml:space="preserve">- A candidate model (</w:t>
+        <w:t xml:space="preserve">- The classifier knows five classes: cardboard, glass, metal, paper, plastic. It cannot recognise organic waste, e-waste or hazardous items, and</w:t>
+      </w:r>
+      <w:r>
+        <w:t xml:space="preserve"> </w:t>
+      </w:r>
+      <w:r>
+        <w:t xml:space="preserve">“other waste”</w:t>
+      </w:r>
+      <w:r>
+        <w:t xml:space="preserve"> </w:t>
+      </w:r>
+      <w:r>
+        <w:t xml:space="preserve">is not a prediction.</w:t>
+      </w:r>
+      <w:r>
+        <w:t xml:space="preserve"> </w:t>
+      </w:r>
+      <w:r>
+        <w:t xml:space="preserve">-</w:t>
+      </w:r>
+      <w:r>
+        <w:t xml:space="preserve"> </w:t>
+      </w:r>
+      <w:r>
+        <w:rPr>
+          <w:b/>
+          <w:bCs/>
+        </w:rPr>
+        <w:t xml:space="preserve">Update 2026-10-22:</w:t>
+      </w:r>
+      <w:r>
+        <w:t xml:space="preserve"> </w:t>
+      </w:r>
+      <w:r>
+        <w:t xml:space="preserve">the model</w:t>
+      </w:r>
+      <w:r>
+        <w:t xml:space="preserve"> </w:t>
       </w:r>
       <w:r>
         <w:rPr>
@@ -2618,77 +2649,63 @@
         <w:t xml:space="preserve">1.0.0</w:t>
       </w:r>
       <w:r>
-        <w:t xml:space="preserve">) was trained only on TrashNet (MIT licence). On its held-out test set it scored</w:t>
-      </w:r>
-      <w:r>
-        <w:t xml:space="preserve"> </w:t>
-      </w:r>
-      <w:r>
-        <w:rPr>
-          <w:b/>
-          <w:bCs/>
-        </w:rPr>
-        <w:t xml:space="preserve">accuracy 0.867</w:t>
-      </w:r>
-      <w:r>
-        <w:t xml:space="preserve"> </w:t>
-      </w:r>
-      <w:r>
-        <w:t xml:space="preserve">(95% interval 0.813–0.912),</w:t>
-      </w:r>
-      <w:r>
-        <w:t xml:space="preserve"> </w:t>
-      </w:r>
-      <w:r>
-        <w:rPr>
-          <w:b/>
-          <w:bCs/>
-        </w:rPr>
-        <w:t xml:space="preserve">macro-F1 0.841</w:t>
-      </w:r>
-      <w:r>
-        <w:t xml:space="preserve">, calibration error 0.031, p95 speed 29.6 ms. Those numbers describe TrashNet photos, which are tidy studio-style images.</w:t>
-      </w:r>
-      <w:r>
-        <w:t xml:space="preserve"> </w:t>
-      </w:r>
-      <w:r>
-        <w:t xml:space="preserve">- On a different public dataset (RealWaste) the same model scored</w:t>
-      </w:r>
-      <w:r>
-        <w:t xml:space="preserve"> </w:t>
-      </w:r>
-      <w:r>
-        <w:rPr>
-          <w:b/>
-          <w:bCs/>
-        </w:rPr>
-        <w:t xml:space="preserve">accuracy 0.454</w:t>
-      </w:r>
-      <w:r>
-        <w:t xml:space="preserve">. That is a large drop and shows it will not generalise to real-world photos without more data.</w:t>
-      </w:r>
-      <w:r>
-        <w:t xml:space="preserve"> </w:t>
-      </w:r>
-      <w:r>
-        <w:t xml:space="preserve">- The review rule sends about</w:t>
-      </w:r>
-      <w:r>
-        <w:t xml:space="preserve"> </w:t>
-      </w:r>
-      <w:r>
-        <w:rPr>
-          <w:b/>
-          <w:bCs/>
-        </w:rPr>
-        <w:t xml:space="preserve">64%</w:t>
-      </w:r>
-      <w:r>
-        <w:t xml:space="preserve"> </w:t>
-      </w:r>
-      <w:r>
-        <w:t xml:space="preserve">of images to a person. This is intentional.</w:t>
+        <w:t xml:space="preserve"> </w:t>
+      </w:r>
+      <w:r>
+        <w:t xml:space="preserve">trained on TrashNet was withdrawn (no written permission for those photographs; its figures are history only). The replacement candidate</w:t>
+      </w:r>
+      <w:r>
+        <w:t xml:space="preserve"> </w:t>
+      </w:r>
+      <w:r>
+        <w:rPr>
+          <w:rStyle w:val="VerbatimChar"/>
+        </w:rPr>
+        <w:t xml:space="preserve">2.0.0</w:t>
+      </w:r>
+      <w:r>
+        <w:t xml:space="preserve"> </w:t>
+      </w:r>
+      <w:r>
+        <w:t xml:space="preserve">is trained only on RealWaste: held-out accuracy</w:t>
+      </w:r>
+      <w:r>
+        <w:t xml:space="preserve"> </w:t>
+      </w:r>
+      <w:r>
+        <w:rPr>
+          <w:b/>
+          <w:bCs/>
+        </w:rPr>
+        <w:t xml:space="preserve">0.895</w:t>
+      </w:r>
+      <w:r>
+        <w:t xml:space="preserve"> </w:t>
+      </w:r>
+      <w:r>
+        <w:t xml:space="preserve">(95% interval 0.855–0.931), macro-F1 0.896, calibration error 0.036 (one Australian facility; not a Hyderabad accuracy).</w:t>
+      </w:r>
+      <w:r>
+        <w:t xml:space="preserve"> </w:t>
+      </w:r>
+      <w:r>
+        <w:t xml:space="preserve">- It</w:t>
+      </w:r>
+      <w:r>
+        <w:t xml:space="preserve"> </w:t>
+      </w:r>
+      <w:r>
+        <w:rPr>
+          <w:b/>
+          <w:bCs/>
+        </w:rPr>
+        <w:t xml:space="preserve">fails</w:t>
+      </w:r>
+      <w:r>
+        <w:t xml:space="preserve"> </w:t>
+      </w:r>
+      <w:r>
+        <w:t xml:space="preserve">the pre-declared acceptance test: 79.7% of out-of-scope images go to a person (required 90%), no field evaluation exists, and the RealWaste licence is contested. It is research-only and inactive.</w:t>
       </w:r>
       <w:r>
         <w:t xml:space="preserve"> </w:t>
@@ -2738,7 +2755,7 @@
         <w:t xml:space="preserve"> </w:t>
       </w:r>
       <w:r>
-        <w:t xml:space="preserve">- The licence position stopped further data: RealWaste is non-commercial (CC BY-NC-SA); TrashBox has no licence; the TACO dataset yielded</w:t>
+        <w:t xml:space="preserve">- The licence position stopped further data: RealWaste is contested (CC BY 4.0 on UCI, CC BY-NC-SA 4.0 on the authors’ GitHub); TrashNet and TrashBox are prohibited; the TACO dataset yielded</w:t>
       </w:r>
       <w:r>
         <w:t xml:space="preserve"> </w:t>

</xml_diff>